<commit_message>
feat: align text with Propuestas.md — 6 meses, herramientas, comparativa, nuevo hero
</commit_message>
<xml_diff>
--- a/public/docs/ConCienciaDigital_Propuesta_Servicios.docx
+++ b/public/docs/ConCienciaDigital_Propuesta_Servicios.docx
@@ -55,6 +55,7 @@
             <w:pPr>
               <w:spacing w:after="80"/>
             </w:pPr>
+            <w:proofErr w:type="spellStart"/>
             <w:r>
               <w:rPr>
                 <w:b/>
@@ -63,7 +64,18 @@
                 <w:sz w:val="36"/>
                 <w:szCs w:val="36"/>
               </w:rPr>
-              <w:t>ConCiencia Digital</w:t>
+              <w:t>ConCiencia</w:t>
+            </w:r>
+            <w:proofErr w:type="spellEnd"/>
+            <w:r>
+              <w:rPr>
+                <w:b/>
+                <w:bCs/>
+                <w:color w:val="FFFFFF"/>
+                <w:sz w:val="36"/>
+                <w:szCs w:val="36"/>
+              </w:rPr>
+              <w:t xml:space="preserve"> Digital</w:t>
             </w:r>
           </w:p>
           <w:p>
@@ -126,7 +138,29 @@
           <w:sz w:val="21"/>
           <w:szCs w:val="21"/>
         </w:rPr>
-        <w:t>La tecnología irrumpió con fuerza en todos los ámbitos, y la educación no es la excepción; con la llegada de la inteligencia artificial, este proceso se aceleró aún más. ConCiencia Digital acompaña a las instituciones a integrarla con sentido pedagógico, criterio y valores — para que sea una herramienta al servicio del aprendizaje, nunca un fin en sí misma.</w:t>
+        <w:t xml:space="preserve">La tecnología irrumpió con fuerza en todos los ámbitos, y la educación no es la excepción; con la llegada de la inteligencia artificial, este proceso se aceleró aún más. </w:t>
+      </w:r>
+      <w:proofErr w:type="spellStart"/>
+      <w:r>
+        <w:rPr>
+          <w:i/>
+          <w:iCs/>
+          <w:color w:val="555555"/>
+          <w:sz w:val="21"/>
+          <w:szCs w:val="21"/>
+        </w:rPr>
+        <w:t>ConCiencia</w:t>
+      </w:r>
+      <w:proofErr w:type="spellEnd"/>
+      <w:r>
+        <w:rPr>
+          <w:i/>
+          <w:iCs/>
+          <w:color w:val="555555"/>
+          <w:sz w:val="21"/>
+          <w:szCs w:val="21"/>
+        </w:rPr>
+        <w:t xml:space="preserve"> Digital acompaña a las instituciones a integrarla con sentido pedagógico, criterio y valores — para que sea una herramienta al servicio del aprendizaje, nunca un fin en sí misma.</w:t>
       </w:r>
       <w:r>
         <w:rPr>
@@ -161,13 +195,23 @@
       <w:pPr>
         <w:spacing w:after="100"/>
       </w:pPr>
+      <w:proofErr w:type="spellStart"/>
       <w:r>
         <w:rPr>
           <w:color w:val="444444"/>
           <w:sz w:val="21"/>
           <w:szCs w:val="21"/>
         </w:rPr>
-        <w:t xml:space="preserve">ConCiencia Digital nace de una trayectoria poco frecuente: diez años de docencia en el aula y una formación profesional en </w:t>
+        <w:t>ConCiencia</w:t>
+      </w:r>
+      <w:proofErr w:type="spellEnd"/>
+      <w:r>
+        <w:rPr>
+          <w:color w:val="444444"/>
+          <w:sz w:val="21"/>
+          <w:szCs w:val="21"/>
+        </w:rPr>
+        <w:t xml:space="preserve"> Digital nace de una trayectoria poco frecuente: diez años de docencia en el aula y una formación profesional en </w:t>
       </w:r>
       <w:r>
         <w:rPr>
@@ -642,7 +686,25 @@
                 <w:sz w:val="21"/>
                 <w:szCs w:val="21"/>
               </w:rPr>
-              <w:t>Los 3 pilares en profundidad: IA, programación y robótica — qué desarrolla cada uno y cómo se baja al aula</w:t>
+              <w:t xml:space="preserve">Demo en vivo de herramientas concretas: </w:t>
+            </w:r>
+            <w:proofErr w:type="spellStart"/>
+            <w:r>
+              <w:rPr>
+                <w:color w:val="444444"/>
+                <w:sz w:val="21"/>
+                <w:szCs w:val="21"/>
+              </w:rPr>
+              <w:t>NotebookLM</w:t>
+            </w:r>
+            <w:proofErr w:type="spellEnd"/>
+            <w:r>
+              <w:rPr>
+                <w:color w:val="444444"/>
+                <w:sz w:val="21"/>
+                <w:szCs w:val="21"/>
+              </w:rPr>
+              <w:t>, Claude y Canva AI aplicadas a proyectos reales</w:t>
             </w:r>
           </w:p>
           <w:p>
@@ -653,14 +715,19 @@
                 <w:numId w:val="2"/>
               </w:numPr>
               <w:spacing w:after="70"/>
-            </w:pPr>
-            <w:r>
-              <w:rPr>
-                <w:color w:val="444444"/>
-                <w:sz w:val="21"/>
-                <w:szCs w:val="21"/>
-              </w:rPr>
-              <w:t>Demo en vivo de herramientas concretas: NotebookLM, Claude y Canva AI aplicadas a proyectos reales</w:t>
+              <w:rPr>
+                <w:color w:val="404040" w:themeColor="text1" w:themeTint="BF"/>
+                <w:sz w:val="21"/>
+                <w:szCs w:val="21"/>
+              </w:rPr>
+            </w:pPr>
+            <w:r>
+              <w:rPr>
+                <w:color w:val="404040" w:themeColor="text1" w:themeTint="BF"/>
+                <w:sz w:val="21"/>
+                <w:szCs w:val="21"/>
+              </w:rPr>
+              <w:t>Cómo usarlas: ejemplos concretos aplicados a planificación, diferenciación, producción de materiales y comunicación con familias</w:t>
             </w:r>
           </w:p>
           <w:p>
@@ -865,7 +932,23 @@
                 <w:sz w:val="21"/>
                 <w:szCs w:val="21"/>
               </w:rPr>
-              <w:t>Instituciones que quieren evaluar la propuesta antes de un compromiso mayor</w:t>
+              <w:t xml:space="preserve">Instituciones que quieren entender de qué se trata realmente la IA </w:t>
+            </w:r>
+            <w:r>
+              <w:rPr>
+                <w:color w:val="444444"/>
+                <w:sz w:val="21"/>
+                <w:szCs w:val="21"/>
+              </w:rPr>
+              <w:t>y cómo impacta en la Educación.</w:t>
+            </w:r>
+            <w:r>
+              <w:rPr>
+                <w:color w:val="444444"/>
+                <w:sz w:val="21"/>
+                <w:szCs w:val="21"/>
+              </w:rPr>
+              <w:t xml:space="preserve"> </w:t>
             </w:r>
           </w:p>
           <w:p>
@@ -883,7 +966,15 @@
                 <w:sz w:val="21"/>
                 <w:szCs w:val="21"/>
               </w:rPr>
-              <w:t>Equipos docentes que tienen poco tiempo disponible pero alta motivación</w:t>
+              <w:t>Equipos docentes que ya usan herramientas digitales intuitivamente y quieren ordenar ese conocimiento con criterio pedagógico</w:t>
+            </w:r>
+            <w:r>
+              <w:rPr>
+                <w:color w:val="444444"/>
+                <w:sz w:val="21"/>
+                <w:szCs w:val="21"/>
+              </w:rPr>
+              <w:t xml:space="preserve"> </w:t>
             </w:r>
           </w:p>
           <w:p>
@@ -919,7 +1010,15 @@
                 <w:sz w:val="21"/>
                 <w:szCs w:val="21"/>
               </w:rPr>
-              <w:t>Instituciones con presupuesto acotado que priorizan un primer impacto real</w:t>
+              <w:t xml:space="preserve">Instituciones </w:t>
+            </w:r>
+            <w:r>
+              <w:rPr>
+                <w:color w:val="444444"/>
+                <w:sz w:val="21"/>
+                <w:szCs w:val="21"/>
+              </w:rPr>
+              <w:t>que valoran probar antes de escalar, y quieren que esa primera experiencia valga la pena.</w:t>
             </w:r>
           </w:p>
         </w:tc>
@@ -1695,14 +1794,23 @@
                 <w:numId w:val="2"/>
               </w:numPr>
               <w:spacing w:after="70"/>
-            </w:pPr>
-            <w:r>
-              <w:rPr>
-                <w:color w:val="444444"/>
-                <w:sz w:val="21"/>
-                <w:szCs w:val="21"/>
-              </w:rPr>
-              <w:t>Instituciones con voluntad de cambio real y sostenido en el tiempo</w:t>
+              <w:rPr>
+                <w:b/>
+                <w:bCs/>
+                <w:color w:val="444444"/>
+                <w:sz w:val="21"/>
+                <w:szCs w:val="21"/>
+              </w:rPr>
+            </w:pPr>
+            <w:r>
+              <w:rPr>
+                <w:b/>
+                <w:bCs/>
+                <w:color w:val="444444"/>
+                <w:sz w:val="21"/>
+                <w:szCs w:val="21"/>
+              </w:rPr>
+              <w:t xml:space="preserve">Instituciones que quieren que la IA deje de ser un tema que genera ansiedad y empiece a ser una herramienta que el equipo docente domina con criterio </w:t>
             </w:r>
           </w:p>
           <w:p>
@@ -1713,14 +1821,19 @@
                 <w:numId w:val="2"/>
               </w:numPr>
               <w:spacing w:after="70"/>
-            </w:pPr>
-            <w:r>
-              <w:rPr>
-                <w:color w:val="444444"/>
-                <w:sz w:val="21"/>
-                <w:szCs w:val="21"/>
-              </w:rPr>
-              <w:t>Equipos docentes con motivación pero que necesitan acompañamiento para implementar</w:t>
+              <w:rPr>
+                <w:color w:val="444444"/>
+                <w:sz w:val="21"/>
+                <w:szCs w:val="21"/>
+              </w:rPr>
+            </w:pPr>
+            <w:r>
+              <w:rPr>
+                <w:color w:val="444444"/>
+                <w:sz w:val="21"/>
+                <w:szCs w:val="21"/>
+              </w:rPr>
+              <w:t xml:space="preserve">Equipos que ya tuvieron una primera experiencia (con esta u otra capacitación) y quieren que algo realmente cambie en el aula </w:t>
             </w:r>
           </w:p>
           <w:p>
@@ -1731,14 +1844,19 @@
                 <w:numId w:val="2"/>
               </w:numPr>
               <w:spacing w:after="70"/>
-            </w:pPr>
-            <w:r>
-              <w:rPr>
-                <w:color w:val="444444"/>
-                <w:sz w:val="21"/>
-                <w:szCs w:val="21"/>
-              </w:rPr>
-              <w:t>Escuelas que ya tienen proyectos en curso y quieren integrar tecnología a lo que están haciendo</w:t>
+              <w:rPr>
+                <w:color w:val="444444"/>
+                <w:sz w:val="21"/>
+                <w:szCs w:val="21"/>
+              </w:rPr>
+            </w:pPr>
+            <w:r>
+              <w:rPr>
+                <w:color w:val="444444"/>
+                <w:sz w:val="21"/>
+                <w:szCs w:val="21"/>
+              </w:rPr>
+              <w:t xml:space="preserve">Escuelas con proyectos pedagógicos propios que quieren integrar tecnología a lo que ya están haciendo — no reemplazarlo </w:t>
             </w:r>
           </w:p>
           <w:p>
@@ -1756,7 +1874,15 @@
                 <w:sz w:val="21"/>
                 <w:szCs w:val="21"/>
               </w:rPr>
-              <w:t>Instituciones que quieren resultados visibles al final del proceso, no solo conciencia</w:t>
+              <w:t xml:space="preserve">Instituciones que quieren poder mostrar resultados concretos al finalizar el año: producciones digitales, secuencias implementadas, docentes </w:t>
+            </w:r>
+            <w:r>
+              <w:rPr>
+                <w:color w:val="444444"/>
+                <w:sz w:val="21"/>
+                <w:szCs w:val="21"/>
+              </w:rPr>
+              <w:t>capacitados.</w:t>
             </w:r>
           </w:p>
         </w:tc>
@@ -1848,14 +1974,23 @@
                 <w:numId w:val="2"/>
               </w:numPr>
               <w:spacing w:after="70"/>
-            </w:pPr>
-            <w:r>
-              <w:rPr>
-                <w:color w:val="444444"/>
-                <w:sz w:val="21"/>
-                <w:szCs w:val="21"/>
-              </w:rPr>
-              <w:t>Un equipo docente con herramientas reales incorporadas a su práctica cotidiana</w:t>
+              <w:rPr>
+                <w:b/>
+                <w:bCs/>
+                <w:color w:val="444444"/>
+                <w:sz w:val="21"/>
+                <w:szCs w:val="21"/>
+              </w:rPr>
+            </w:pPr>
+            <w:r>
+              <w:rPr>
+                <w:b/>
+                <w:bCs/>
+                <w:color w:val="444444"/>
+                <w:sz w:val="21"/>
+                <w:szCs w:val="21"/>
+              </w:rPr>
+              <w:t xml:space="preserve">Docentes que pasaron de usar la IA intuitivamente a usarla con criterio, propósito y confianza </w:t>
             </w:r>
           </w:p>
           <w:p>
@@ -1866,14 +2001,19 @@
                 <w:numId w:val="2"/>
               </w:numPr>
               <w:spacing w:after="70"/>
-            </w:pPr>
-            <w:r>
-              <w:rPr>
-                <w:color w:val="444444"/>
-                <w:sz w:val="21"/>
-                <w:szCs w:val="21"/>
-              </w:rPr>
-              <w:t>Al menos una producción digital por grado o área vinculada a los proyectos del año</w:t>
+              <w:rPr>
+                <w:color w:val="444444"/>
+                <w:sz w:val="21"/>
+                <w:szCs w:val="21"/>
+              </w:rPr>
+            </w:pPr>
+            <w:r>
+              <w:rPr>
+                <w:color w:val="444444"/>
+                <w:sz w:val="21"/>
+                <w:szCs w:val="21"/>
+              </w:rPr>
+              <w:t xml:space="preserve">Al menos una secuencia didáctica con integración tecnológica real por grado o área — diseñada junto al docente, no para el docente </w:t>
             </w:r>
           </w:p>
           <w:p>
@@ -1884,14 +2024,19 @@
                 <w:numId w:val="2"/>
               </w:numPr>
               <w:spacing w:after="70"/>
-            </w:pPr>
-            <w:r>
-              <w:rPr>
-                <w:color w:val="444444"/>
-                <w:sz w:val="21"/>
-                <w:szCs w:val="21"/>
-              </w:rPr>
-              <w:t>Una cultura institucional de uso crítico y responsable de la tecnología</w:t>
+              <w:rPr>
+                <w:color w:val="444444"/>
+                <w:sz w:val="21"/>
+                <w:szCs w:val="21"/>
+              </w:rPr>
+            </w:pPr>
+            <w:r>
+              <w:rPr>
+                <w:color w:val="444444"/>
+                <w:sz w:val="21"/>
+                <w:szCs w:val="21"/>
+              </w:rPr>
+              <w:t xml:space="preserve">Producciones digitales de los alumnos vinculadas a los proyectos del año </w:t>
             </w:r>
           </w:p>
           <w:p>
@@ -1902,14 +2047,38 @@
                 <w:numId w:val="2"/>
               </w:numPr>
               <w:spacing w:after="70"/>
-            </w:pPr>
-            <w:r>
-              <w:rPr>
-                <w:color w:val="444444"/>
-                <w:sz w:val="21"/>
-                <w:szCs w:val="21"/>
-              </w:rPr>
-              <w:t>Un camino propio trazado: qué continuar, cómo crecer, qué herramientas priorizar</w:t>
+              <w:rPr>
+                <w:color w:val="444444"/>
+                <w:sz w:val="21"/>
+                <w:szCs w:val="21"/>
+              </w:rPr>
+            </w:pPr>
+            <w:r>
+              <w:rPr>
+                <w:color w:val="444444"/>
+                <w:sz w:val="21"/>
+                <w:szCs w:val="21"/>
+              </w:rPr>
+              <w:lastRenderedPageBreak/>
+              <w:t xml:space="preserve">Una cultura institucional donde la pregunta no es "¿usamos tecnología?" sino "¿cómo la usamos bien?" </w:t>
+            </w:r>
+          </w:p>
+          <w:p>
+            <w:pPr>
+              <w:pStyle w:val="Prrafodelista"/>
+              <w:numPr>
+                <w:ilvl w:val="0"/>
+                <w:numId w:val="2"/>
+              </w:numPr>
+              <w:spacing w:after="70"/>
+            </w:pPr>
+            <w:r>
+              <w:rPr>
+                <w:color w:val="444444"/>
+                <w:sz w:val="21"/>
+                <w:szCs w:val="21"/>
+              </w:rPr>
+              <w:t>Un camino trazado hacia adelante: qué continuar, cómo crecer, qué herramientas priorizar el próximo año</w:t>
             </w:r>
           </w:p>
         </w:tc>
@@ -1988,7 +2157,6 @@
                 <w:sz w:val="28"/>
                 <w:szCs w:val="28"/>
               </w:rPr>
-              <w:lastRenderedPageBreak/>
               <w:t>Acompañamiento guiado</w:t>
             </w:r>
           </w:p>
@@ -2030,7 +2198,6 @@
                 <w:sz w:val="48"/>
                 <w:szCs w:val="48"/>
               </w:rPr>
-              <w:lastRenderedPageBreak/>
               <w:t>$280.000</w:t>
             </w:r>
           </w:p>
@@ -2072,7 +2239,17 @@
           <w:sz w:val="19"/>
           <w:szCs w:val="19"/>
         </w:rPr>
-        <w:t>Equivale a $93.000 por mes — casi el mismo valor que la charla única, pero con tres meses de acompañamiento real. · Pago: 50% al inicio, 50% al cierre del proceso.</w:t>
+        <w:t xml:space="preserve">Pago: </w:t>
+      </w:r>
+      <w:r>
+        <w:rPr>
+          <w:i/>
+          <w:iCs/>
+          <w:color w:val="777777"/>
+          <w:sz w:val="19"/>
+          <w:szCs w:val="19"/>
+        </w:rPr>
+        <w:t>100% al inicio o divisible en 6 cuotas fijas al mismo valor</w:t>
       </w:r>
     </w:p>
     <w:p>
@@ -3243,18 +3420,53 @@
                 <w:sz w:val="21"/>
                 <w:szCs w:val="21"/>
               </w:rPr>
-              <w:lastRenderedPageBreak/>
-              <w:t>Ingeniero de IA · Docente · Fundador de ConCiencia Digital</w:t>
-            </w:r>
-          </w:p>
-          <w:p>
+              <w:t xml:space="preserve">Ingeniero de IA · Docente · Fundador de </w:t>
+            </w:r>
+            <w:proofErr w:type="spellStart"/>
+            <w:r>
+              <w:rPr>
+                <w:color w:val="444444"/>
+                <w:sz w:val="21"/>
+                <w:szCs w:val="21"/>
+              </w:rPr>
+              <w:t>ConCiencia</w:t>
+            </w:r>
+            <w:proofErr w:type="spellEnd"/>
+            <w:r>
+              <w:rPr>
+                <w:color w:val="444444"/>
+                <w:sz w:val="21"/>
+                <w:szCs w:val="21"/>
+              </w:rPr>
+              <w:t xml:space="preserve"> Digital</w:t>
+            </w:r>
+          </w:p>
+          <w:p>
+            <w:proofErr w:type="gramStart"/>
             <w:r>
               <w:rPr>
                 <w:color w:val="666666"/>
                 <w:sz w:val="20"/>
                 <w:szCs w:val="20"/>
               </w:rPr>
-              <w:t>concienciadigital@gmail.com  ·  WhatsApp: [tu número]</w:t>
+              <w:t>concienciadigital@gmail.com  ·</w:t>
+            </w:r>
+            <w:proofErr w:type="gramEnd"/>
+            <w:r>
+              <w:rPr>
+                <w:color w:val="666666"/>
+                <w:sz w:val="20"/>
+                <w:szCs w:val="20"/>
+              </w:rPr>
+              <w:t xml:space="preserve">  WhatsApp: </w:t>
+            </w:r>
+            <w:r>
+              <w:rPr>
+                <w:color w:val="666666"/>
+                <w:sz w:val="20"/>
+                <w:szCs w:val="20"/>
+              </w:rPr>
+              <w:t>1165916614</w:t>
             </w:r>
           </w:p>
         </w:tc>
@@ -3342,13 +3554,59 @@
     <w:pPr>
       <w:jc w:val="center"/>
     </w:pPr>
+    <w:proofErr w:type="spellStart"/>
     <w:r>
       <w:rPr>
         <w:color w:val="AAAAAA"/>
         <w:sz w:val="17"/>
         <w:szCs w:val="17"/>
       </w:rPr>
-      <w:t>ConCiencia Digital  ·  Propuesta de servicios  ·  202</w:t>
+      <w:t>ConCiencia</w:t>
+    </w:r>
+    <w:proofErr w:type="spellEnd"/>
+    <w:r>
+      <w:rPr>
+        <w:color w:val="AAAAAA"/>
+        <w:sz w:val="17"/>
+        <w:szCs w:val="17"/>
+      </w:rPr>
+      <w:t xml:space="preserve"> </w:t>
+    </w:r>
+    <w:proofErr w:type="gramStart"/>
+    <w:r>
+      <w:rPr>
+        <w:color w:val="AAAAAA"/>
+        <w:sz w:val="17"/>
+        <w:szCs w:val="17"/>
+      </w:rPr>
+      <w:t>Digital  ·</w:t>
+    </w:r>
+    <w:proofErr w:type="gramEnd"/>
+    <w:r>
+      <w:rPr>
+        <w:color w:val="AAAAAA"/>
+        <w:sz w:val="17"/>
+        <w:szCs w:val="17"/>
+      </w:rPr>
+      <w:t xml:space="preserve">  Propuesta de </w:t>
+    </w:r>
+    <w:proofErr w:type="gramStart"/>
+    <w:r>
+      <w:rPr>
+        <w:color w:val="AAAAAA"/>
+        <w:sz w:val="17"/>
+        <w:szCs w:val="17"/>
+      </w:rPr>
+      <w:t>servicios  ·</w:t>
+    </w:r>
+    <w:proofErr w:type="gramEnd"/>
+    <w:r>
+      <w:rPr>
+        <w:color w:val="AAAAAA"/>
+        <w:sz w:val="17"/>
+        <w:szCs w:val="17"/>
+      </w:rPr>
+      <w:t xml:space="preserve">  202</w:t>
     </w:r>
     <w:r>
       <w:rPr>
@@ -3423,13 +3681,32 @@
           <w:vAlign w:val="center"/>
         </w:tcPr>
         <w:p>
+          <w:proofErr w:type="spellStart"/>
           <w:r>
             <w:rPr>
               <w:b/>
               <w:bCs/>
               <w:color w:val="0F6E56"/>
             </w:rPr>
-            <w:t>ConCiencia Digital</w:t>
+            <w:t>ConCiencia</w:t>
+          </w:r>
+          <w:proofErr w:type="spellEnd"/>
+          <w:r>
+            <w:rPr>
+              <w:b/>
+              <w:bCs/>
+              <w:color w:val="0F6E56"/>
+            </w:rPr>
+            <w:t xml:space="preserve"> </w:t>
+          </w:r>
+          <w:proofErr w:type="gramStart"/>
+          <w:r>
+            <w:rPr>
+              <w:b/>
+              <w:bCs/>
+              <w:color w:val="0F6E56"/>
+            </w:rPr>
+            <w:t>Digital</w:t>
           </w:r>
           <w:r>
             <w:rPr>
@@ -3437,7 +3714,16 @@
               <w:sz w:val="19"/>
               <w:szCs w:val="19"/>
             </w:rPr>
-            <w:t xml:space="preserve">  |  Tecnología con propósito para docentes y escuelas</w:t>
+            <w:t xml:space="preserve">  |</w:t>
+          </w:r>
+          <w:proofErr w:type="gramEnd"/>
+          <w:r>
+            <w:rPr>
+              <w:color w:val="888888"/>
+              <w:sz w:val="19"/>
+              <w:szCs w:val="19"/>
+            </w:rPr>
+            <w:t xml:space="preserve">  Tecnología con propósito para docentes y escuelas</w:t>
           </w:r>
         </w:p>
       </w:tc>

</xml_diff>